<commit_message>
Journées : horaires 10h-16h et paiement 20 % / solde à J-7 sur devis et contrats.
Aligne la génération PDF, le workflow admin et le modèle Word sur les conditions charter journée.

Co-authored-by: Cursor <cursoragent@cursor.com>
</commit_message>
<xml_diff>
--- a/client/public/docs/day-charter-template.docx
+++ b/client/public/docs/day-charter-template.docx
@@ -1141,63 +1141,9 @@
         </w:rPr>
       </w:pPr>
       <w:r>
-        <w:rPr>
-          <w:rFonts w:ascii="Times New Roman" w:eastAsia="Times New Roman" w:hAnsi="Times New Roman" w:cs="Times New Roman"/>
-          <w:sz w:val="24"/>
-          <w:szCs w:val="24"/>
-          <w:lang w:eastAsia="fr-FR"/>
-        </w:rPr>
-        <w:t xml:space="preserve">Acompte de </w:t>
-      </w:r>
-      <w:r>
-        <w:rPr>
-          <w:rFonts w:ascii="Times New Roman" w:eastAsia="Times New Roman" w:hAnsi="Times New Roman" w:cs="Times New Roman"/>
-          <w:b/>
-          <w:bCs/>
-          <w:sz w:val="24"/>
-          <w:szCs w:val="24"/>
-          <w:lang w:eastAsia="fr-FR"/>
-        </w:rPr>
-        <w:t>50 %</w:t>
-      </w:r>
-      <w:r>
-        <w:rPr>
-          <w:rFonts w:ascii="Times New Roman" w:eastAsia="Times New Roman" w:hAnsi="Times New Roman" w:cs="Times New Roman"/>
-          <w:sz w:val="24"/>
-          <w:szCs w:val="24"/>
-          <w:lang w:eastAsia="fr-FR"/>
-        </w:rPr>
-        <w:t xml:space="preserve"> à la réservation, </w:t>
-      </w:r>
-      <w:r>
-        <w:rPr>
-          <w:rFonts w:ascii="Times New Roman" w:eastAsia="Times New Roman" w:hAnsi="Times New Roman" w:cs="Times New Roman"/>
-          <w:sz w:val="24"/>
-          <w:szCs w:val="24"/>
-          <w:lang w:eastAsia="fr-FR"/>
-        </w:rPr>
+        <w:t xml:space="preserve">Acompte de 20 % à la réservation, </w:t>
         <w:br/>
-        <w:t xml:space="preserve">Solde au plus tard </w:t>
-      </w:r>
-      <w:r>
-        <w:rPr>
-          <w:rFonts w:ascii="Times New Roman" w:eastAsia="Times New Roman" w:hAnsi="Times New Roman" w:cs="Times New Roman"/>
-          <w:b/>
-          <w:bCs/>
-          <w:sz w:val="24"/>
-          <w:szCs w:val="24"/>
-          <w:lang w:eastAsia="fr-FR"/>
-        </w:rPr>
-        <w:t>7 jours avant embarquement</w:t>
-      </w:r>
-      <w:r>
-        <w:rPr>
-          <w:rFonts w:ascii="Times New Roman" w:eastAsia="Times New Roman" w:hAnsi="Times New Roman" w:cs="Times New Roman"/>
-          <w:sz w:val="24"/>
-          <w:szCs w:val="24"/>
-          <w:lang w:eastAsia="fr-FR"/>
-        </w:rPr>
-        <w:t>.</w:t>
+        <w:t>Solde au plus tard 7 jours avant embarquement.</w:t>
       </w:r>
     </w:p>
     <w:p>

</xml_diff>